<commit_message>
Updates to risk scoring and updated documentation
</commit_message>
<xml_diff>
--- a/Application/Documentation/01a_Risk_Scoring_Technical.docx
+++ b/Application/Documentation/01a_Risk_Scoring_Technical.docx
@@ -4524,6 +4524,418 @@
     </w:p>
     <w:p>
       <w:pPr>
+        <w:pStyle w:val="Heading2"/>
+      </w:pPr>
+      <w:r>
+        <w:rPr>
+          <w:rFonts w:ascii="Arial" w:cs="Arial" w:eastAsia="Arial" w:hAnsi="Arial"/>
+        </w:rPr>
+        <w:t xml:space="preserve">4.4  Document and Page-Level Risk</w:t>
+      </w:r>
+    </w:p>
+    <w:p>
+      <w:pPr>
+        <w:spacing w:after="80" w:before="80"/>
+      </w:pPr>
+      <w:r>
+        <w:rPr>
+          <w:rFonts w:ascii="Arial" w:cs="Arial" w:eastAsia="Arial" w:hAnsi="Arial"/>
+          <w:color w:val="000000"/>
+          <w:sz w:val="22"/>
+          <w:szCs w:val="22"/>
+        </w:rPr>
+        <w:t xml:space="preserve">Sections 4.1 to 4.3 score each image placement individually. Two finding types, TEXT_OVERLAY and FONT_ANOMALY, describe a page or the document as a whole rather than any single image, so they cannot be attributed to one image and are scored in a separate document-risk dimension. Every analyzed document therefore carries two independent score families: the per-image scores of 4.2 and the page and document scores defined here. Each finding type contributes to exactly one family, so no signal is counted twice and none is detected but left unscored.</w:t>
+      </w:r>
+    </w:p>
+    <w:p>
+      <w:pPr>
+        <w:spacing w:after="80" w:before="80"/>
+      </w:pPr>
+      <w:r>
+        <w:rPr>
+          <w:rFonts w:ascii="Arial" w:cs="Arial" w:eastAsia="Arial" w:hAnsi="Arial"/>
+          <w:color w:val="000000"/>
+          <w:sz w:val="22"/>
+          <w:szCs w:val="22"/>
+        </w:rPr>
+        <w:t xml:space="preserve">Document-level finding weights (analysis/risk.py, DOC_RISK_WEIGHTS):</w:t>
+      </w:r>
+    </w:p>
+    <w:tbl>
+      <w:tblPr>
+        <w:tblW w:type="dxa" w:w="9360"/>
+        <w:tblBorders>
+          <w:top w:val="single" w:color="auto" w:sz="4"/>
+          <w:left w:val="single" w:color="auto" w:sz="4"/>
+          <w:bottom w:val="single" w:color="auto" w:sz="4"/>
+          <w:right w:val="single" w:color="auto" w:sz="4"/>
+          <w:insideH w:val="single" w:color="auto" w:sz="4"/>
+          <w:insideV w:val="single" w:color="auto" w:sz="4"/>
+        </w:tblBorders>
+      </w:tblPr>
+      <w:tblGrid>
+        <w:gridCol w:w="2000"/>
+        <w:gridCol w:w="700"/>
+        <w:gridCol w:w="6660"/>
+      </w:tblGrid>
+      <w:tr>
+        <w:tc>
+          <w:tcPr>
+            <w:tcW w:type="dxa" w:w="2000"/>
+            <w:tcBorders>
+              <w:top w:val="single" w:color="CCCCCC" w:sz="1"/>
+              <w:left w:val="single" w:color="CCCCCC" w:sz="1"/>
+              <w:bottom w:val="single" w:color="CCCCCC" w:sz="1"/>
+              <w:right w:val="single" w:color="CCCCCC" w:sz="1"/>
+            </w:tcBorders>
+            <w:shd w:fill="2B2B2B" w:val="clear"/>
+            <w:tcMar>
+              <w:top w:type="dxa" w:w="80"/>
+              <w:left w:type="dxa" w:w="120"/>
+              <w:bottom w:type="dxa" w:w="80"/>
+              <w:right w:type="dxa" w:w="120"/>
+            </w:tcMar>
+          </w:tcPr>
+          <w:p>
+            <w:r>
+              <w:rPr>
+                <w:rFonts w:ascii="Arial" w:cs="Arial" w:eastAsia="Arial" w:hAnsi="Arial"/>
+                <w:b/>
+                <w:bCs/>
+                <w:color w:val="FFFFFF"/>
+                <w:sz w:val="18"/>
+                <w:szCs w:val="18"/>
+              </w:rPr>
+              <w:t xml:space="preserve">Finding Code</w:t>
+            </w:r>
+          </w:p>
+        </w:tc>
+        <w:tc>
+          <w:tcPr>
+            <w:tcW w:type="dxa" w:w="700"/>
+            <w:tcBorders>
+              <w:top w:val="single" w:color="CCCCCC" w:sz="1"/>
+              <w:left w:val="single" w:color="CCCCCC" w:sz="1"/>
+              <w:bottom w:val="single" w:color="CCCCCC" w:sz="1"/>
+              <w:right w:val="single" w:color="CCCCCC" w:sz="1"/>
+            </w:tcBorders>
+            <w:shd w:fill="2B2B2B" w:val="clear"/>
+            <w:tcMar>
+              <w:top w:type="dxa" w:w="80"/>
+              <w:left w:type="dxa" w:w="120"/>
+              <w:bottom w:type="dxa" w:w="80"/>
+              <w:right w:type="dxa" w:w="120"/>
+            </w:tcMar>
+          </w:tcPr>
+          <w:p>
+            <w:r>
+              <w:rPr>
+                <w:rFonts w:ascii="Arial" w:cs="Arial" w:eastAsia="Arial" w:hAnsi="Arial"/>
+                <w:b/>
+                <w:bCs/>
+                <w:color w:val="FFFFFF"/>
+                <w:sz w:val="18"/>
+                <w:szCs w:val="18"/>
+              </w:rPr>
+              <w:t xml:space="preserve">Wt</w:t>
+            </w:r>
+          </w:p>
+        </w:tc>
+        <w:tc>
+          <w:tcPr>
+            <w:tcW w:type="dxa" w:w="6660"/>
+            <w:tcBorders>
+              <w:top w:val="single" w:color="CCCCCC" w:sz="1"/>
+              <w:left w:val="single" w:color="CCCCCC" w:sz="1"/>
+              <w:bottom w:val="single" w:color="CCCCCC" w:sz="1"/>
+              <w:right w:val="single" w:color="CCCCCC" w:sz="1"/>
+            </w:tcBorders>
+            <w:shd w:fill="2B2B2B" w:val="clear"/>
+            <w:tcMar>
+              <w:top w:type="dxa" w:w="80"/>
+              <w:left w:type="dxa" w:w="120"/>
+              <w:bottom w:type="dxa" w:w="80"/>
+              <w:right w:type="dxa" w:w="120"/>
+            </w:tcMar>
+          </w:tcPr>
+          <w:p>
+            <w:r>
+              <w:rPr>
+                <w:rFonts w:ascii="Arial" w:cs="Arial" w:eastAsia="Arial" w:hAnsi="Arial"/>
+                <w:b/>
+                <w:bCs/>
+                <w:color w:val="FFFFFF"/>
+                <w:sz w:val="18"/>
+                <w:szCs w:val="18"/>
+              </w:rPr>
+              <w:t xml:space="preserve">Basis</w:t>
+            </w:r>
+          </w:p>
+        </w:tc>
+      </w:tr>
+      <w:tr>
+        <w:tc>
+          <w:tcPr>
+            <w:tcW w:type="dxa" w:w="2000"/>
+            <w:tcBorders>
+              <w:top w:val="single" w:color="CCCCCC" w:sz="1"/>
+              <w:left w:val="single" w:color="CCCCCC" w:sz="1"/>
+              <w:bottom w:val="single" w:color="CCCCCC" w:sz="1"/>
+              <w:right w:val="single" w:color="CCCCCC" w:sz="1"/>
+            </w:tcBorders>
+            <w:shd w:fill="FFFFFF" w:val="clear"/>
+            <w:tcMar>
+              <w:top w:type="dxa" w:w="80"/>
+              <w:left w:type="dxa" w:w="120"/>
+              <w:bottom w:type="dxa" w:w="80"/>
+              <w:right w:type="dxa" w:w="120"/>
+            </w:tcMar>
+          </w:tcPr>
+          <w:p>
+            <w:r>
+              <w:rPr>
+                <w:rFonts w:ascii="Arial" w:cs="Arial" w:eastAsia="Arial" w:hAnsi="Arial"/>
+                <w:b w:val="false"/>
+                <w:bCs w:val="false"/>
+                <w:color w:val="000000"/>
+                <w:sz w:val="18"/>
+                <w:szCs w:val="18"/>
+              </w:rPr>
+              <w:t xml:space="preserve">TEXT_OVERLAY</w:t>
+            </w:r>
+          </w:p>
+        </w:tc>
+        <w:tc>
+          <w:tcPr>
+            <w:tcW w:type="dxa" w:w="700"/>
+            <w:tcBorders>
+              <w:top w:val="single" w:color="CCCCCC" w:sz="1"/>
+              <w:left w:val="single" w:color="CCCCCC" w:sz="1"/>
+              <w:bottom w:val="single" w:color="CCCCCC" w:sz="1"/>
+              <w:right w:val="single" w:color="CCCCCC" w:sz="1"/>
+            </w:tcBorders>
+            <w:shd w:fill="FFFFFF" w:val="clear"/>
+            <w:tcMar>
+              <w:top w:type="dxa" w:w="80"/>
+              <w:left w:type="dxa" w:w="120"/>
+              <w:bottom w:type="dxa" w:w="80"/>
+              <w:right w:type="dxa" w:w="120"/>
+            </w:tcMar>
+          </w:tcPr>
+          <w:p>
+            <w:r>
+              <w:rPr>
+                <w:rFonts w:ascii="Arial" w:cs="Arial" w:eastAsia="Arial" w:hAnsi="Arial"/>
+                <w:b w:val="false"/>
+                <w:bCs w:val="false"/>
+                <w:color w:val="000000"/>
+                <w:sz w:val="18"/>
+                <w:szCs w:val="18"/>
+              </w:rPr>
+              <w:t xml:space="preserve">35</w:t>
+            </w:r>
+          </w:p>
+        </w:tc>
+        <w:tc>
+          <w:tcPr>
+            <w:tcW w:type="dxa" w:w="6660"/>
+            <w:tcBorders>
+              <w:top w:val="single" w:color="CCCCCC" w:sz="1"/>
+              <w:left w:val="single" w:color="CCCCCC" w:sz="1"/>
+              <w:bottom w:val="single" w:color="CCCCCC" w:sz="1"/>
+              <w:right w:val="single" w:color="CCCCCC" w:sz="1"/>
+            </w:tcBorders>
+            <w:shd w:fill="FFFFFF" w:val="clear"/>
+            <w:tcMar>
+              <w:top w:type="dxa" w:w="80"/>
+              <w:left w:type="dxa" w:w="120"/>
+              <w:bottom w:type="dxa" w:w="80"/>
+              <w:right w:type="dxa" w:w="120"/>
+            </w:tcMar>
+          </w:tcPr>
+          <w:p>
+            <w:r>
+              <w:rPr>
+                <w:rFonts w:ascii="Arial" w:cs="Arial" w:eastAsia="Arial" w:hAnsi="Arial"/>
+                <w:b w:val="false"/>
+                <w:bCs w:val="false"/>
+                <w:color w:val="000000"/>
+                <w:sz w:val="18"/>
+                <w:szCs w:val="18"/>
+              </w:rPr>
+              <w:t xml:space="preserve">Text or annotation content painted on top of existing page content (detectors.py: check_text_overlays, check_content_stream_text_overlay, check_text_over_text). A strong alteration signal: overlaid text is a common mechanism for changing names, figures, dates, or totals after the fact. Weighted equal to OVERLAP_BACK_FULL.</w:t>
+            </w:r>
+          </w:p>
+        </w:tc>
+      </w:tr>
+      <w:tr>
+        <w:tc>
+          <w:tcPr>
+            <w:tcW w:type="dxa" w:w="2000"/>
+            <w:tcBorders>
+              <w:top w:val="single" w:color="CCCCCC" w:sz="1"/>
+              <w:left w:val="single" w:color="CCCCCC" w:sz="1"/>
+              <w:bottom w:val="single" w:color="CCCCCC" w:sz="1"/>
+              <w:right w:val="single" w:color="CCCCCC" w:sz="1"/>
+            </w:tcBorders>
+            <w:shd w:fill="FFFFFF" w:val="clear"/>
+            <w:tcMar>
+              <w:top w:type="dxa" w:w="80"/>
+              <w:left w:type="dxa" w:w="120"/>
+              <w:bottom w:type="dxa" w:w="80"/>
+              <w:right w:type="dxa" w:w="120"/>
+            </w:tcMar>
+          </w:tcPr>
+          <w:p>
+            <w:r>
+              <w:rPr>
+                <w:rFonts w:ascii="Arial" w:cs="Arial" w:eastAsia="Arial" w:hAnsi="Arial"/>
+                <w:b w:val="false"/>
+                <w:bCs w:val="false"/>
+                <w:color w:val="000000"/>
+                <w:sz w:val="18"/>
+                <w:szCs w:val="18"/>
+              </w:rPr>
+              <w:t xml:space="preserve">FONT_ANOMALY</w:t>
+            </w:r>
+          </w:p>
+        </w:tc>
+        <w:tc>
+          <w:tcPr>
+            <w:tcW w:type="dxa" w:w="700"/>
+            <w:tcBorders>
+              <w:top w:val="single" w:color="CCCCCC" w:sz="1"/>
+              <w:left w:val="single" w:color="CCCCCC" w:sz="1"/>
+              <w:bottom w:val="single" w:color="CCCCCC" w:sz="1"/>
+              <w:right w:val="single" w:color="CCCCCC" w:sz="1"/>
+            </w:tcBorders>
+            <w:shd w:fill="FFFFFF" w:val="clear"/>
+            <w:tcMar>
+              <w:top w:type="dxa" w:w="80"/>
+              <w:left w:type="dxa" w:w="120"/>
+              <w:bottom w:type="dxa" w:w="80"/>
+              <w:right w:type="dxa" w:w="120"/>
+            </w:tcMar>
+          </w:tcPr>
+          <w:p>
+            <w:r>
+              <w:rPr>
+                <w:rFonts w:ascii="Arial" w:cs="Arial" w:eastAsia="Arial" w:hAnsi="Arial"/>
+                <w:b w:val="false"/>
+                <w:bCs w:val="false"/>
+                <w:color w:val="000000"/>
+                <w:sz w:val="18"/>
+                <w:szCs w:val="18"/>
+              </w:rPr>
+              <w:t xml:space="preserve">15</w:t>
+            </w:r>
+          </w:p>
+        </w:tc>
+        <w:tc>
+          <w:tcPr>
+            <w:tcW w:type="dxa" w:w="6660"/>
+            <w:tcBorders>
+              <w:top w:val="single" w:color="CCCCCC" w:sz="1"/>
+              <w:left w:val="single" w:color="CCCCCC" w:sz="1"/>
+              <w:bottom w:val="single" w:color="CCCCCC" w:sz="1"/>
+              <w:right w:val="single" w:color="CCCCCC" w:sz="1"/>
+            </w:tcBorders>
+            <w:shd w:fill="FFFFFF" w:val="clear"/>
+            <w:tcMar>
+              <w:top w:type="dxa" w:w="80"/>
+              <w:left w:type="dxa" w:w="120"/>
+              <w:bottom w:type="dxa" w:w="80"/>
+              <w:right w:type="dxa" w:w="120"/>
+            </w:tcMar>
+          </w:tcPr>
+          <w:p>
+            <w:r>
+              <w:rPr>
+                <w:rFonts w:ascii="Arial" w:cs="Arial" w:eastAsia="Arial" w:hAnsi="Arial"/>
+                <w:b w:val="false"/>
+                <w:bCs w:val="false"/>
+                <w:color w:val="000000"/>
+                <w:sz w:val="18"/>
+                <w:szCs w:val="18"/>
+              </w:rPr>
+              <w:t xml:space="preserve">A font used inconsistently with the surrounding document (detectors.py: font-analysis pass; each finding carries its page number). Corroborating rather than decisive: legitimately authored documents routinely mix fonts, so the weight is lower and the false-positive rate higher. Equal to OVERLAP_BACK_PARTIAL, enough to reach the MID tier on its own.</w:t>
+            </w:r>
+          </w:p>
+        </w:tc>
+      </w:tr>
+    </w:tbl>
+    <w:p>
+      <w:pPr>
+        <w:spacing w:after="80" w:before="80"/>
+      </w:pPr>
+      <w:r>
+        <w:rPr>
+          <w:rFonts w:ascii="Arial" w:cs="Arial" w:eastAsia="Arial" w:hAnsi="Arial"/>
+          <w:color w:val="000000"/>
+          <w:sz w:val="22"/>
+          <w:szCs w:val="22"/>
+        </w:rPr>
+        <w:t xml:space="preserve">The presence of any reviewer comments or markup annotations adds a flat +5 (COMMENT_RISK_WEIGHT) to the document score. This is informational: comments are not themselves evidence of manipulation, but an annotated document warrants the examiner’s attention, and the flag keeps comment-bearing files visible in ranked output.</w:t>
+      </w:r>
+    </w:p>
+    <w:p>
+      <w:pPr>
+        <w:spacing w:after="80" w:before="80"/>
+      </w:pPr>
+      <w:r>
+        <w:rPr>
+          <w:rFonts w:ascii="Arial" w:cs="Arial" w:eastAsia="Arial" w:hAnsi="Arial"/>
+          <w:color w:val="000000"/>
+          <w:sz w:val="22"/>
+          <w:szCs w:val="22"/>
+        </w:rPr>
+        <w:t xml:space="preserve">Accumulation formulae:</w:t>
+      </w:r>
+    </w:p>
+    <w:p>
+      <w:pPr>
+        <w:spacing w:after="80" w:before="80"/>
+      </w:pPr>
+      <w:r>
+        <w:rPr>
+          <w:rFonts w:ascii="Arial" w:cs="Arial" w:eastAsia="Arial" w:hAnsi="Arial"/>
+          <w:color w:val="000000"/>
+          <w:sz w:val="20"/>
+          <w:szCs w:val="20"/>
+        </w:rPr>
+        <w:t xml:space="preserve">page_risk(p) = MIN( SUM(weight_i for each document-level finding on page p), 100 )</w:t>
+      </w:r>
+    </w:p>
+    <w:p>
+      <w:pPr>
+        <w:spacing w:after="80" w:before="80"/>
+      </w:pPr>
+      <w:r>
+        <w:rPr>
+          <w:rFonts w:ascii="Arial" w:cs="Arial" w:eastAsia="Arial" w:hAnsi="Arial"/>
+          <w:color w:val="000000"/>
+          <w:sz w:val="20"/>
+          <w:szCs w:val="20"/>
+        </w:rPr>
+        <w:t xml:space="preserve">doc_risk = MIN( MAX(page_risk(p) over all pages p) + (COMMENT_RISK_WEIGHT if any comments else 0), 100 )</w:t>
+      </w:r>
+    </w:p>
+    <w:p>
+      <w:pPr>
+        <w:spacing w:after="80" w:before="80"/>
+      </w:pPr>
+      <w:r>
+        <w:rPr>
+          <w:rFonts w:ascii="Arial" w:cs="Arial" w:eastAsia="Arial" w:hAnsi="Arial"/>
+          <w:color w:val="000000"/>
+          <w:sz w:val="22"/>
+          <w:szCs w:val="22"/>
+        </w:rPr>
+        <w:t xml:space="preserve">The document score uses the maximum page score, not the sum across pages. It answers “how suspicious is the most suspicious page?” rather than “how many findings does the document contain in total”, so a single heavily altered page is neither diluted by the document’s clean pages nor allowed to inflate the score by their count. Both quantities are computed in analysis/risk.py compute_document_risk() and persisted by database.py save_to_db(): the page score in pages.risk_score and the document score in analyses.doc_risk_score (schema revision 6). The Document Risk Summary report (HTML Reports reference, Document Overview group) ranks documents by analyses.doc_risk_score.</w:t>
+      </w:r>
+    </w:p>
+    <w:p>
+      <w:pPr>
         <w:pStyle w:val="Heading1"/>
       </w:pPr>
       <w:r>
@@ -5073,6 +5485,157 @@
           <w:szCs w:val="18"/>
         </w:rPr>
         <w:t xml:space="preserve">ORDER BY i.risk_score DESC;</w:t>
+      </w:r>
+    </w:p>
+    <w:p>
+      <w:pPr>
+        <w:pStyle w:val="Heading2"/>
+      </w:pPr>
+      <w:r>
+        <w:rPr>
+          <w:rFonts w:ascii="Arial" w:cs="Arial" w:eastAsia="Arial" w:hAnsi="Arial"/>
+        </w:rPr>
+        <w:t xml:space="preserve">5.1  Document and Page Risk Columns (schema revision 6)</w:t>
+      </w:r>
+    </w:p>
+    <w:p>
+      <w:pPr>
+        <w:spacing w:after="80" w:before="80"/>
+      </w:pPr>
+      <w:r>
+        <w:rPr>
+          <w:rFonts w:ascii="Arial" w:cs="Arial" w:eastAsia="Arial" w:hAnsi="Arial"/>
+          <w:color w:val="000000"/>
+          <w:sz w:val="22"/>
+          <w:szCs w:val="22"/>
+        </w:rPr>
+        <w:t xml:space="preserve">Schema revision 6 adds two integer columns that store the document-risk dimension described in 4.4. Both default to 0 and are populated by save_to_db(). The migration is additive and idempotent: opening an older database upgrades it in place, existing rows keep a score of 0 until re-analysis, and no data is lost.</w:t>
+      </w:r>
+    </w:p>
+    <w:p>
+      <w:pPr>
+        <w:spacing w:after="80" w:before="80"/>
+      </w:pPr>
+      <w:r>
+        <w:rPr>
+          <w:rFonts w:ascii="Arial" w:cs="Arial" w:eastAsia="Arial" w:hAnsi="Arial"/>
+          <w:color w:val="000000"/>
+          <w:sz w:val="20"/>
+          <w:szCs w:val="20"/>
+        </w:rPr>
+        <w:t xml:space="preserve">analyses.doc_risk_score  INTEGER DEFAULT 0   -- document-level score (0-100), per 4.4</w:t>
+      </w:r>
+    </w:p>
+    <w:p>
+      <w:pPr>
+        <w:spacing w:after="80" w:before="80"/>
+      </w:pPr>
+      <w:r>
+        <w:rPr>
+          <w:rFonts w:ascii="Arial" w:cs="Arial" w:eastAsia="Arial" w:hAnsi="Arial"/>
+          <w:color w:val="000000"/>
+          <w:sz w:val="20"/>
+          <w:szCs w:val="20"/>
+        </w:rPr>
+        <w:t xml:space="preserve">pages.risk_score         INTEGER DEFAULT 0   -- per-page score (0-100), per 4.4</w:t>
+      </w:r>
+    </w:p>
+    <w:p>
+      <w:pPr>
+        <w:spacing w:after="80" w:before="80"/>
+      </w:pPr>
+      <w:r>
+        <w:rPr>
+          <w:rFonts w:ascii="Arial" w:cs="Arial" w:eastAsia="Arial" w:hAnsi="Arial"/>
+          <w:color w:val="000000"/>
+          <w:sz w:val="22"/>
+          <w:szCs w:val="22"/>
+        </w:rPr>
+        <w:t xml:space="preserve">SQLite query to rank documents by document risk:</w:t>
+      </w:r>
+    </w:p>
+    <w:p>
+      <w:pPr>
+        <w:spacing w:after="80" w:before="80"/>
+      </w:pPr>
+      <w:r>
+        <w:rPr>
+          <w:rFonts w:ascii="Arial" w:cs="Arial" w:eastAsia="Arial" w:hAnsi="Arial"/>
+          <w:color w:val="000000"/>
+          <w:sz w:val="20"/>
+          <w:szCs w:val="20"/>
+        </w:rPr>
+        <w:t xml:space="preserve">SELECT a.pdf_filename, a.doc_risk_score,</w:t>
+      </w:r>
+    </w:p>
+    <w:p>
+      <w:pPr>
+        <w:spacing w:after="80" w:before="80"/>
+      </w:pPr>
+      <w:r>
+        <w:rPr>
+          <w:rFonts w:ascii="Arial" w:cs="Arial" w:eastAsia="Arial" w:hAnsi="Arial"/>
+          <w:color w:val="000000"/>
+          <w:sz w:val="20"/>
+          <w:szCs w:val="20"/>
+        </w:rPr>
+        <w:t xml:space="preserve">       COALESCE(MAX(p.risk_score), 0) AS highest_page_risk</w:t>
+      </w:r>
+    </w:p>
+    <w:p>
+      <w:pPr>
+        <w:spacing w:after="80" w:before="80"/>
+      </w:pPr>
+      <w:r>
+        <w:rPr>
+          <w:rFonts w:ascii="Arial" w:cs="Arial" w:eastAsia="Arial" w:hAnsi="Arial"/>
+          <w:color w:val="000000"/>
+          <w:sz w:val="20"/>
+          <w:szCs w:val="20"/>
+        </w:rPr>
+        <w:t xml:space="preserve">FROM analyses a</w:t>
+      </w:r>
+    </w:p>
+    <w:p>
+      <w:pPr>
+        <w:spacing w:after="80" w:before="80"/>
+      </w:pPr>
+      <w:r>
+        <w:rPr>
+          <w:rFonts w:ascii="Arial" w:cs="Arial" w:eastAsia="Arial" w:hAnsi="Arial"/>
+          <w:color w:val="000000"/>
+          <w:sz w:val="20"/>
+          <w:szCs w:val="20"/>
+        </w:rPr>
+        <w:t xml:space="preserve">LEFT JOIN pages p ON p.analysis_id = a.id</w:t>
+      </w:r>
+    </w:p>
+    <w:p>
+      <w:pPr>
+        <w:spacing w:after="80" w:before="80"/>
+      </w:pPr>
+      <w:r>
+        <w:rPr>
+          <w:rFonts w:ascii="Arial" w:cs="Arial" w:eastAsia="Arial" w:hAnsi="Arial"/>
+          <w:color w:val="000000"/>
+          <w:sz w:val="20"/>
+          <w:szCs w:val="20"/>
+        </w:rPr>
+        <w:t xml:space="preserve">GROUP BY a.id</w:t>
+      </w:r>
+    </w:p>
+    <w:p>
+      <w:pPr>
+        <w:spacing w:after="80" w:before="80"/>
+      </w:pPr>
+      <w:r>
+        <w:rPr>
+          <w:rFonts w:ascii="Arial" w:cs="Arial" w:eastAsia="Arial" w:hAnsi="Arial"/>
+          <w:color w:val="000000"/>
+          <w:sz w:val="20"/>
+          <w:szCs w:val="20"/>
+        </w:rPr>
+        <w:t xml:space="preserve">ORDER BY a.doc_risk_score DESC;</w:t>
       </w:r>
     </w:p>
     <w:p>

</xml_diff>

<commit_message>
Minor corrections to documentation
</commit_message>
<xml_diff>
--- a/Application/Documentation/01a_Risk_Scoring_Technical.docx
+++ b/Application/Documentation/01a_Risk_Scoring_Technical.docx
@@ -6899,6 +6899,225 @@
           <w:szCs w:val="22"/>
         </w:rPr>
         <w:t xml:space="preserve">Both migrations are additive and run automatically when an older database is opened; existing rows are unchanged.</w:t>
+      </w:r>
+    </w:p>
+    <w:p>
+      <w:pPr>
+        <w:pStyle w:val="Heading2"/>
+      </w:pPr>
+      <w:r>
+        <w:rPr>
+          <w:rFonts w:ascii="Arial" w:cs="Arial" w:eastAsia="Arial" w:hAnsi="Arial"/>
+        </w:rPr>
+        <w:t xml:space="preserve">5.4  Encryption Record (schema revision 9)</w:t>
+      </w:r>
+    </w:p>
+    <w:p>
+      <w:pPr>
+        <w:spacing w:after="80" w:before="80"/>
+      </w:pPr>
+      <w:r>
+        <w:rPr>
+          <w:rFonts w:ascii="Arial" w:cs="Arial" w:eastAsia="Arial" w:hAnsi="Arial"/>
+          <w:color w:val="000000"/>
+          <w:sz w:val="22"/>
+          <w:szCs w:val="22"/>
+        </w:rPr>
+        <w:t xml:space="preserve">Every encrypted file the application handles is recorded in the encryption table, one row per file per run, whether or not it could be opened. The row states whether a password opened the file, the password that worked and where it came from (the empty password, a password already found to work in the run, or a line of the supplied list), the encryption scheme, how many passwords were tried, and the analysis that followed. The Encrypted Files report is built from this table, so it can be regenerated from the database on a later run. A file that no password opened is also recorded in the submissions table (5.3) with the outcome encrypted_unopened. This table does not affect any score. Because it holds the passwords that opened files, the database should be handled with the same care as the password list.</w:t>
+      </w:r>
+    </w:p>
+    <w:p>
+      <w:pPr>
+        <w:pBdr>
+          <w:left w:val="single" w:color="ED1C24" w:sz="6" w:space="4"/>
+        </w:pBdr>
+        <w:shd w:fill="F0F0F0" w:val="clear"/>
+        <w:spacing w:after="0" w:before="0"/>
+      </w:pPr>
+      <w:r>
+        <w:rPr>
+          <w:rFonts w:ascii="Courier New" w:cs="Courier New" w:eastAsia="Courier New" w:hAnsi="Courier New"/>
+          <w:color w:val="333333"/>
+          <w:sz w:val="18"/>
+          <w:szCs w:val="18"/>
+        </w:rPr>
+        <w:t xml:space="preserve">CREATE TABLE encryption (</w:t>
+      </w:r>
+    </w:p>
+    <w:p>
+      <w:pPr>
+        <w:pBdr>
+          <w:left w:val="single" w:color="ED1C24" w:sz="6" w:space="4"/>
+        </w:pBdr>
+        <w:shd w:fill="F0F0F0" w:val="clear"/>
+        <w:spacing w:after="0" w:before="0"/>
+      </w:pPr>
+      <w:r>
+        <w:rPr>
+          <w:rFonts w:ascii="Courier New" w:cs="Courier New" w:eastAsia="Courier New" w:hAnsi="Courier New"/>
+          <w:color w:val="333333"/>
+          <w:sz w:val="18"/>
+          <w:szCs w:val="18"/>
+        </w:rPr>
+        <w:t xml:space="preserve">  id INTEGER PRIMARY KEY, session_ts TEXT, recorded_at TEXT NOT NULL,</w:t>
+      </w:r>
+    </w:p>
+    <w:p>
+      <w:pPr>
+        <w:pBdr>
+          <w:left w:val="single" w:color="ED1C24" w:sz="6" w:space="4"/>
+        </w:pBdr>
+        <w:shd w:fill="F0F0F0" w:val="clear"/>
+        <w:spacing w:after="0" w:before="0"/>
+      </w:pPr>
+      <w:r>
+        <w:rPr>
+          <w:rFonts w:ascii="Courier New" w:cs="Courier New" w:eastAsia="Courier New" w:hAnsi="Courier New"/>
+          <w:color w:val="333333"/>
+          <w:sz w:val="18"/>
+          <w:szCs w:val="18"/>
+        </w:rPr>
+        <w:t xml:space="preserve">  pdf_path TEXT NOT NULL, pdf_filename TEXT NOT NULL, pdf_md5 TEXT,</w:t>
+      </w:r>
+    </w:p>
+    <w:p>
+      <w:pPr>
+        <w:pBdr>
+          <w:left w:val="single" w:color="ED1C24" w:sz="6" w:space="4"/>
+        </w:pBdr>
+        <w:shd w:fill="F0F0F0" w:val="clear"/>
+        <w:spacing w:after="0" w:before="0"/>
+      </w:pPr>
+      <w:r>
+        <w:rPr>
+          <w:rFonts w:ascii="Courier New" w:cs="Courier New" w:eastAsia="Courier New" w:hAnsi="Courier New"/>
+          <w:color w:val="333333"/>
+          <w:sz w:val="18"/>
+          <w:szCs w:val="18"/>
+        </w:rPr>
+        <w:t xml:space="preserve">  is_encrypted INTEGER NOT NULL, opened INTEGER NOT NULL,</w:t>
+      </w:r>
+    </w:p>
+    <w:p>
+      <w:pPr>
+        <w:pBdr>
+          <w:left w:val="single" w:color="ED1C24" w:sz="6" w:space="4"/>
+        </w:pBdr>
+        <w:shd w:fill="F0F0F0" w:val="clear"/>
+        <w:spacing w:after="0" w:before="0"/>
+      </w:pPr>
+      <w:r>
+        <w:rPr>
+          <w:rFonts w:ascii="Courier New" w:cs="Courier New" w:eastAsia="Courier New" w:hAnsi="Courier New"/>
+          <w:color w:val="333333"/>
+          <w:sz w:val="18"/>
+          <w:szCs w:val="18"/>
+        </w:rPr>
+        <w:t xml:space="preserve">  password TEXT,         -- the password that worked ("" = empty); NULL if none</w:t>
+      </w:r>
+    </w:p>
+    <w:p>
+      <w:pPr>
+        <w:pBdr>
+          <w:left w:val="single" w:color="ED1C24" w:sz="6" w:space="4"/>
+        </w:pBdr>
+        <w:shd w:fill="F0F0F0" w:val="clear"/>
+        <w:spacing w:after="0" w:before="0"/>
+      </w:pPr>
+      <w:r>
+        <w:rPr>
+          <w:rFonts w:ascii="Courier New" w:cs="Courier New" w:eastAsia="Courier New" w:hAnsi="Courier New"/>
+          <w:color w:val="333333"/>
+          <w:sz w:val="18"/>
+          <w:szCs w:val="18"/>
+        </w:rPr>
+        <w:t xml:space="preserve">  password_source TEXT,  -- "empty", "known-good" or "list line N"; if not</w:t>
+      </w:r>
+    </w:p>
+    <w:p>
+      <w:pPr>
+        <w:pBdr>
+          <w:left w:val="single" w:color="ED1C24" w:sz="6" w:space="4"/>
+        </w:pBdr>
+        <w:shd w:fill="F0F0F0" w:val="clear"/>
+        <w:spacing w:after="0" w:before="0"/>
+      </w:pPr>
+      <w:r>
+        <w:rPr>
+          <w:rFonts w:ascii="Courier New" w:cs="Courier New" w:eastAsia="Courier New" w:hAnsi="Courier New"/>
+          <w:color w:val="333333"/>
+          <w:sz w:val="18"/>
+          <w:szCs w:val="18"/>
+        </w:rPr>
+        <w:t xml:space="preserve">                         -- opened, why (e.g. "no password list supplied")</w:t>
+      </w:r>
+    </w:p>
+    <w:p>
+      <w:pPr>
+        <w:pBdr>
+          <w:left w:val="single" w:color="ED1C24" w:sz="6" w:space="4"/>
+        </w:pBdr>
+        <w:shd w:fill="F0F0F0" w:val="clear"/>
+        <w:spacing w:after="0" w:before="0"/>
+      </w:pPr>
+      <w:r>
+        <w:rPr>
+          <w:rFonts w:ascii="Courier New" w:cs="Courier New" w:eastAsia="Courier New" w:hAnsi="Courier New"/>
+          <w:color w:val="333333"/>
+          <w:sz w:val="18"/>
+          <w:szCs w:val="18"/>
+        </w:rPr>
+        <w:t xml:space="preserve">  scheme TEXT,           -- e.g. "AES-256 (V5 R6)"</w:t>
+      </w:r>
+    </w:p>
+    <w:p>
+      <w:pPr>
+        <w:pBdr>
+          <w:left w:val="single" w:color="ED1C24" w:sz="6" w:space="4"/>
+        </w:pBdr>
+        <w:shd w:fill="F0F0F0" w:val="clear"/>
+        <w:spacing w:after="0" w:before="0"/>
+      </w:pPr>
+      <w:r>
+        <w:rPr>
+          <w:rFonts w:ascii="Courier New" w:cs="Courier New" w:eastAsia="Courier New" w:hAnsi="Courier New"/>
+          <w:color w:val="333333"/>
+          <w:sz w:val="18"/>
+          <w:szCs w:val="18"/>
+        </w:rPr>
+        <w:t xml:space="preserve">  attempts INTEGER,      -- passwords tried on this file</w:t>
+      </w:r>
+    </w:p>
+    <w:p>
+      <w:pPr>
+        <w:pBdr>
+          <w:left w:val="single" w:color="ED1C24" w:sz="6" w:space="4"/>
+        </w:pBdr>
+        <w:shd w:fill="F0F0F0" w:val="clear"/>
+        <w:spacing w:after="0" w:before="0"/>
+      </w:pPr>
+      <w:r>
+        <w:rPr>
+          <w:rFonts w:ascii="Courier New" w:cs="Courier New" w:eastAsia="Courier New" w:hAnsi="Courier New"/>
+          <w:color w:val="333333"/>
+          <w:sz w:val="18"/>
+          <w:szCs w:val="18"/>
+        </w:rPr>
+        <w:t xml:space="preserve">  analysis_id INTEGER);  -- the analysis of the opened file</w:t>
+      </w:r>
+    </w:p>
+    <w:p>
+      <w:pPr>
+        <w:spacing w:after="80" w:before="80"/>
+      </w:pPr>
+      <w:r>
+        <w:rPr>
+          <w:rFonts w:ascii="Arial" w:cs="Arial" w:eastAsia="Arial" w:hAnsi="Arial"/>
+          <w:color w:val="000000"/>
+          <w:sz w:val="22"/>
+          <w:szCs w:val="22"/>
+        </w:rPr>
+        <w:t xml:space="preserve">The migration is additive and runs automatically when an older database is opened; existing rows are unchanged.</w:t>
       </w:r>
     </w:p>
     <w:p>

</xml_diff>